<commit_message>
Update invoicing and user access control documentation
Enhance documentation to include details on ESO data exchange, CBC AG customer migration, e-invoicing for financial authorities, and the explanation of RBAC (Role-Based Access Control) in user management.

Replit-Commit-Author: Agent
Replit-Commit-Session-Id: ff1ca1cf-8bf7-47f7-8e87-0cee42fb9d05
Replit-Commit-Checkpoint-Type: full_checkpoint
Replit-Commit-Event-Id: d3698267-f987-4b8e-bb33-0c67af601ec0
Replit-Commit-Screenshot-Url: https://storage.googleapis.com/screenshot-production-us-central1/fc828d39-61cd-41d5-ba8d-20e8af9db227/ff1ca1cf-8bf7-47f7-8e87-0cee42fb9d05/nkst2k3
Replit-Helium-Checkpoint-Created: true
</commit_message>
<xml_diff>
--- a/indexus_overview.docx
+++ b/indexus_overview.docx
@@ -5908,6 +5908,175 @@
           <w:sz w:val="22"/>
           <w:szCs w:val="22"/>
         </w:rPr>
+        <w:t xml:space="preserve">Strategické rozhodnutia a rozšírenia</w:t>
+      </w:r>
+    </w:p>
+    <w:p>
+      <w:pPr>
+        <w:shd w:fill="FEF9E7" w:val="solid"/>
+        <w:spacing w:after="80" w:before="80"/>
+      </w:pPr>
+      <w:r>
+        <w:rPr>
+          <w:rFonts w:ascii="Calibri" w:cs="Calibri" w:eastAsia="Calibri" w:hAnsi="Calibri"/>
+          <w:color w:val="2980B9"/>
+          <w:sz w:val="20"/>
+          <w:szCs w:val="20"/>
+        </w:rPr>
+        <w:t xml:space="preserve">Fakturácia v INDEXUS nie je izolovaná — je súčasťou širšieho ekosystému: musí byť prepojená s ekonomickým systémom ESO, zabezpečiť migráciu zákazníkov pod CBC AG a splniť legislatívne požiadavky na elektronickú fakturáciu voči Finančnej správe SR.</w:t>
+      </w:r>
+    </w:p>
+    <w:p>
+      <w:pPr>
+        <w:spacing w:after="0" w:before="0"/>
+      </w:pPr>
+      <w:r>
+        <w:rPr>
+          <w:sz w:val="14"/>
+          <w:szCs w:val="14"/>
+        </w:rPr>
+        <w:t xml:space="preserve"/>
+      </w:r>
+    </w:p>
+    <w:p>
+      <w:pPr>
+        <w:spacing w:after="80" w:before="220"/>
+      </w:pPr>
+      <w:r>
+        <w:rPr>
+          <w:rFonts w:ascii="Calibri" w:cs="Calibri" w:eastAsia="Calibri" w:hAnsi="Calibri"/>
+          <w:b/>
+          <w:bCs/>
+          <w:color w:val="2980B9"/>
+          <w:sz w:val="22"/>
+          <w:szCs w:val="22"/>
+        </w:rPr>
+        <w:t xml:space="preserve">Čo je ESO a prečo je prepojenie dôležité?</w:t>
+      </w:r>
+    </w:p>
+    <w:p>
+      <w:pPr>
+        <w:spacing w:after="40" w:before="40"/>
+      </w:pPr>
+      <w:r>
+        <w:rPr>
+          <w:rFonts w:ascii="Calibri" w:cs="Calibri" w:eastAsia="Calibri" w:hAnsi="Calibri"/>
+          <w:color w:val="2C3E50"/>
+          <w:sz w:val="20"/>
+          <w:szCs w:val="20"/>
+        </w:rPr>
+        <w:t xml:space="preserve">ESO je ekonomický/účtovný systém spoločnosti, v ktorom sa evidujú faktúry, platby, náklady a výnosy. Bez dátovej výmeny medzi INDEXUS a ESO by bolo potrebné každú faktúru zadávať do oboch systémov ručne — čo je chybové a neefektívne. Prepojenie umožní automatický prenos vystavených faktúr z INDEXUS do ESO.</w:t>
+      </w:r>
+    </w:p>
+    <w:p>
+      <w:pPr>
+        <w:spacing w:after="0" w:before="0"/>
+      </w:pPr>
+      <w:r>
+        <w:rPr>
+          <w:sz w:val="14"/>
+          <w:szCs w:val="14"/>
+        </w:rPr>
+        <w:t xml:space="preserve"/>
+      </w:r>
+    </w:p>
+    <w:p>
+      <w:pPr>
+        <w:spacing w:after="80" w:before="220"/>
+      </w:pPr>
+      <w:r>
+        <w:rPr>
+          <w:rFonts w:ascii="Calibri" w:cs="Calibri" w:eastAsia="Calibri" w:hAnsi="Calibri"/>
+          <w:b/>
+          <w:bCs/>
+          <w:color w:val="2980B9"/>
+          <w:sz w:val="22"/>
+          <w:szCs w:val="22"/>
+        </w:rPr>
+        <w:t xml:space="preserve">Čo je elektronická fakturácia pre Finančnú správu?</w:t>
+      </w:r>
+    </w:p>
+    <w:p>
+      <w:pPr>
+        <w:spacing w:after="40" w:before="40"/>
+      </w:pPr>
+      <w:r>
+        <w:rPr>
+          <w:rFonts w:ascii="Calibri" w:cs="Calibri" w:eastAsia="Calibri" w:hAnsi="Calibri"/>
+          <w:color w:val="2C3E50"/>
+          <w:sz w:val="20"/>
+          <w:szCs w:val="20"/>
+        </w:rPr>
+        <w:t xml:space="preserve">Od roku 2025 platí povinnosť pre B2B transakcie podávať informácie o vystavených faktúrach elektronicky priamo Finančnej správe SR (systém e-Faktura / e-Invoice). INDEXUS musí vedieť generovať faktúry v požadovanom elektronickom formáte (UBL/XML) a odosielať ich cez príslušné API Finančnej správy.</w:t>
+      </w:r>
+    </w:p>
+    <w:p>
+      <w:pPr>
+        <w:spacing w:after="0" w:before="0"/>
+      </w:pPr>
+      <w:r>
+        <w:rPr>
+          <w:sz w:val="14"/>
+          <w:szCs w:val="14"/>
+        </w:rPr>
+        <w:t xml:space="preserve"/>
+      </w:r>
+    </w:p>
+    <w:p>
+      <w:pPr>
+        <w:spacing w:after="80" w:before="220"/>
+      </w:pPr>
+      <w:r>
+        <w:rPr>
+          <w:rFonts w:ascii="Calibri" w:cs="Calibri" w:eastAsia="Calibri" w:hAnsi="Calibri"/>
+          <w:b/>
+          <w:bCs/>
+          <w:color w:val="2980B9"/>
+          <w:sz w:val="22"/>
+          <w:szCs w:val="22"/>
+        </w:rPr>
+        <w:t xml:space="preserve">Čo je migrácia zákazníkov na CBC AG?</w:t>
+      </w:r>
+    </w:p>
+    <w:p>
+      <w:pPr>
+        <w:spacing w:after="40" w:before="40"/>
+      </w:pPr>
+      <w:r>
+        <w:rPr>
+          <w:rFonts w:ascii="Calibri" w:cs="Calibri" w:eastAsia="Calibri" w:hAnsi="Calibri"/>
+          <w:color w:val="2C3E50"/>
+          <w:sz w:val="20"/>
+          <w:szCs w:val="20"/>
+        </w:rPr>
+        <w:t xml:space="preserve">CBC AG je materská spoločnosť, pod ktorú budú prevedení všetci zákazníci do konca roka. Táto migrácia znamená zmenu fakturačného subjektu — faktúry budú vystavované v mene CBC AG, nie pôvodných lokálnych entít. V INDEXUS to vyžaduje zmenu billing_company_accounts per zákazník a úpravu šablón faktúr (logo, IČO, bankové spojenie).</w:t>
+      </w:r>
+    </w:p>
+    <w:p>
+      <w:pPr>
+        <w:spacing w:after="0" w:before="0"/>
+      </w:pPr>
+      <w:r>
+        <w:rPr>
+          <w:sz w:val="14"/>
+          <w:szCs w:val="14"/>
+        </w:rPr>
+        <w:t xml:space="preserve"/>
+      </w:r>
+    </w:p>
+    <w:p>
+      <w:pPr>
+        <w:spacing w:after="80" w:before="220"/>
+      </w:pPr>
+      <w:r>
+        <w:rPr>
+          <w:rFonts w:ascii="Calibri" w:cs="Calibri" w:eastAsia="Calibri" w:hAnsi="Calibri"/>
+          <w:b/>
+          <w:bCs/>
+          <w:color w:val="2980B9"/>
+          <w:sz w:val="22"/>
+          <w:szCs w:val="22"/>
+        </w:rPr>
         <w:t xml:space="preserve">Plán úprav</w:t>
       </w:r>
     </w:p>
@@ -6257,6 +6426,246 @@
                 <w:szCs w:val="18"/>
               </w:rPr>
               <w:t xml:space="preserve">Pripravené, doplniť a zadefinovať fakturačné spoločnosti</w:t>
+            </w:r>
+          </w:p>
+        </w:tc>
+      </w:tr>
+      <w:tr>
+        <w:tc>
+          <w:tcPr>
+            <w:tcW w:type="dxa" w:w="1200"/>
+            <w:tcMar>
+              <w:top w:type="dxa" w:w="60"/>
+              <w:left w:type="dxa" w:w="100"/>
+              <w:bottom w:type="dxa" w:w="60"/>
+              <w:right w:type="dxa" w:w="100"/>
+            </w:tcMar>
+          </w:tcPr>
+          <w:p>
+            <w:pPr>
+              <w:spacing w:after="50" w:before="50"/>
+              <w:jc w:val="left"/>
+            </w:pPr>
+            <w:r>
+              <w:rPr>
+                <w:rFonts w:ascii="Calibri" w:cs="Calibri" w:eastAsia="Calibri" w:hAnsi="Calibri"/>
+                <w:b/>
+                <w:bCs/>
+                <w:color w:val="C0392B"/>
+                <w:sz w:val="18"/>
+                <w:szCs w:val="18"/>
+              </w:rPr>
+              <w:t xml:space="preserve">Kritická</w:t>
+            </w:r>
+          </w:p>
+        </w:tc>
+        <w:tc>
+          <w:tcPr>
+            <w:tcW w:type="dxa" w:w="5800"/>
+            <w:tcMar>
+              <w:top w:type="dxa" w:w="60"/>
+              <w:left w:type="dxa" w:w="100"/>
+              <w:bottom w:type="dxa" w:w="60"/>
+              <w:right w:type="dxa" w:w="100"/>
+            </w:tcMar>
+          </w:tcPr>
+          <w:p>
+            <w:pPr>
+              <w:spacing w:after="50" w:before="50"/>
+              <w:jc w:val="left"/>
+            </w:pPr>
+            <w:r>
+              <w:rPr>
+                <w:rFonts w:ascii="Calibri" w:cs="Calibri" w:eastAsia="Calibri" w:hAnsi="Calibri"/>
+                <w:sz w:val="18"/>
+                <w:szCs w:val="18"/>
+              </w:rPr>
+              <w:t xml:space="preserve">Dátová výmena s ekonomickým systémom ESO</w:t>
+            </w:r>
+          </w:p>
+        </w:tc>
+        <w:tc>
+          <w:tcPr>
+            <w:tcW w:type="dxa" w:w="1800"/>
+            <w:tcMar>
+              <w:top w:type="dxa" w:w="60"/>
+              <w:left w:type="dxa" w:w="100"/>
+              <w:bottom w:type="dxa" w:w="60"/>
+              <w:right w:type="dxa" w:w="100"/>
+            </w:tcMar>
+          </w:tcPr>
+          <w:p>
+            <w:pPr>
+              <w:spacing w:after="50" w:before="50"/>
+              <w:jc w:val="left"/>
+            </w:pPr>
+            <w:r>
+              <w:rPr>
+                <w:rFonts w:ascii="Calibri" w:cs="Calibri" w:eastAsia="Calibri" w:hAnsi="Calibri"/>
+                <w:sz w:val="18"/>
+                <w:szCs w:val="18"/>
+              </w:rPr>
+              <w:t xml:space="preserve">Definovať rozhranie (API / export súbor) — obojsmerný prenos faktúr a platieb</w:t>
+            </w:r>
+          </w:p>
+        </w:tc>
+      </w:tr>
+      <w:tr>
+        <w:tc>
+          <w:tcPr>
+            <w:tcW w:type="dxa" w:w="1200"/>
+            <w:tcMar>
+              <w:top w:type="dxa" w:w="60"/>
+              <w:left w:type="dxa" w:w="100"/>
+              <w:bottom w:type="dxa" w:w="60"/>
+              <w:right w:type="dxa" w:w="100"/>
+            </w:tcMar>
+          </w:tcPr>
+          <w:p>
+            <w:pPr>
+              <w:spacing w:after="50" w:before="50"/>
+              <w:jc w:val="left"/>
+            </w:pPr>
+            <w:r>
+              <w:rPr>
+                <w:rFonts w:ascii="Calibri" w:cs="Calibri" w:eastAsia="Calibri" w:hAnsi="Calibri"/>
+                <w:b/>
+                <w:bCs/>
+                <w:color w:val="C0392B"/>
+                <w:sz w:val="18"/>
+                <w:szCs w:val="18"/>
+              </w:rPr>
+              <w:t xml:space="preserve">Kritická</w:t>
+            </w:r>
+          </w:p>
+        </w:tc>
+        <w:tc>
+          <w:tcPr>
+            <w:tcW w:type="dxa" w:w="5800"/>
+            <w:tcMar>
+              <w:top w:type="dxa" w:w="60"/>
+              <w:left w:type="dxa" w:w="100"/>
+              <w:bottom w:type="dxa" w:w="60"/>
+              <w:right w:type="dxa" w:w="100"/>
+            </w:tcMar>
+          </w:tcPr>
+          <w:p>
+            <w:pPr>
+              <w:spacing w:after="50" w:before="50"/>
+              <w:jc w:val="left"/>
+            </w:pPr>
+            <w:r>
+              <w:rPr>
+                <w:rFonts w:ascii="Calibri" w:cs="Calibri" w:eastAsia="Calibri" w:hAnsi="Calibri"/>
+                <w:sz w:val="18"/>
+                <w:szCs w:val="18"/>
+              </w:rPr>
+              <w:t xml:space="preserve">Migrácia všetkých zákazníkov pod CBC AG (do konca roka)</w:t>
+            </w:r>
+          </w:p>
+        </w:tc>
+        <w:tc>
+          <w:tcPr>
+            <w:tcW w:type="dxa" w:w="1800"/>
+            <w:tcMar>
+              <w:top w:type="dxa" w:w="60"/>
+              <w:left w:type="dxa" w:w="100"/>
+              <w:bottom w:type="dxa" w:w="60"/>
+              <w:right w:type="dxa" w:w="100"/>
+            </w:tcMar>
+          </w:tcPr>
+          <w:p>
+            <w:pPr>
+              <w:spacing w:after="50" w:before="50"/>
+              <w:jc w:val="left"/>
+            </w:pPr>
+            <w:r>
+              <w:rPr>
+                <w:rFonts w:ascii="Calibri" w:cs="Calibri" w:eastAsia="Calibri" w:hAnsi="Calibri"/>
+                <w:sz w:val="18"/>
+                <w:szCs w:val="18"/>
+              </w:rPr>
+              <w:t xml:space="preserve">Zmena billing subjektu per zákazník, úprava šablón faktúr (logo, IČO, IBAN CBC AG)</w:t>
+            </w:r>
+          </w:p>
+        </w:tc>
+      </w:tr>
+      <w:tr>
+        <w:tc>
+          <w:tcPr>
+            <w:tcW w:type="dxa" w:w="1200"/>
+            <w:tcMar>
+              <w:top w:type="dxa" w:w="60"/>
+              <w:left w:type="dxa" w:w="100"/>
+              <w:bottom w:type="dxa" w:w="60"/>
+              <w:right w:type="dxa" w:w="100"/>
+            </w:tcMar>
+          </w:tcPr>
+          <w:p>
+            <w:pPr>
+              <w:spacing w:after="50" w:before="50"/>
+              <w:jc w:val="left"/>
+            </w:pPr>
+            <w:r>
+              <w:rPr>
+                <w:rFonts w:ascii="Calibri" w:cs="Calibri" w:eastAsia="Calibri" w:hAnsi="Calibri"/>
+                <w:b/>
+                <w:bCs/>
+                <w:color w:val="C0392B"/>
+                <w:sz w:val="18"/>
+                <w:szCs w:val="18"/>
+              </w:rPr>
+              <w:t xml:space="preserve">Kritická</w:t>
+            </w:r>
+          </w:p>
+        </w:tc>
+        <w:tc>
+          <w:tcPr>
+            <w:tcW w:type="dxa" w:w="5800"/>
+            <w:tcMar>
+              <w:top w:type="dxa" w:w="60"/>
+              <w:left w:type="dxa" w:w="100"/>
+              <w:bottom w:type="dxa" w:w="60"/>
+              <w:right w:type="dxa" w:w="100"/>
+            </w:tcMar>
+          </w:tcPr>
+          <w:p>
+            <w:pPr>
+              <w:spacing w:after="50" w:before="50"/>
+              <w:jc w:val="left"/>
+            </w:pPr>
+            <w:r>
+              <w:rPr>
+                <w:rFonts w:ascii="Calibri" w:cs="Calibri" w:eastAsia="Calibri" w:hAnsi="Calibri"/>
+                <w:sz w:val="18"/>
+                <w:szCs w:val="18"/>
+              </w:rPr>
+              <w:t xml:space="preserve">Elektronická fakturácia pre Finančnú správu SR (e-Invoice)</w:t>
+            </w:r>
+          </w:p>
+        </w:tc>
+        <w:tc>
+          <w:tcPr>
+            <w:tcW w:type="dxa" w:w="1800"/>
+            <w:tcMar>
+              <w:top w:type="dxa" w:w="60"/>
+              <w:left w:type="dxa" w:w="100"/>
+              <w:bottom w:type="dxa" w:w="60"/>
+              <w:right w:type="dxa" w:w="100"/>
+            </w:tcMar>
+          </w:tcPr>
+          <w:p>
+            <w:pPr>
+              <w:spacing w:after="50" w:before="50"/>
+              <w:jc w:val="left"/>
+            </w:pPr>
+            <w:r>
+              <w:rPr>
+                <w:rFonts w:ascii="Calibri" w:cs="Calibri" w:eastAsia="Calibri" w:hAnsi="Calibri"/>
+                <w:sz w:val="18"/>
+                <w:szCs w:val="18"/>
+              </w:rPr>
+              <w:t xml:space="preserve">Generovanie faktúr vo formáte UBL/XML, napojenie na API Finančnej správy</w:t>
             </w:r>
           </w:p>
         </w:tc>
@@ -10361,6 +10770,634 @@
     </w:p>
     <w:p>
       <w:pPr>
+        <w:spacing w:after="80" w:before="220"/>
+      </w:pPr>
+      <w:r>
+        <w:rPr>
+          <w:rFonts w:ascii="Calibri" w:cs="Calibri" w:eastAsia="Calibri" w:hAnsi="Calibri"/>
+          <w:b/>
+          <w:bCs/>
+          <w:color w:val="2C3E50"/>
+          <w:sz w:val="22"/>
+          <w:szCs w:val="22"/>
+        </w:rPr>
+        <w:t xml:space="preserve">Čo je RBAC — vysvetlenie pre nezainteresovaných</w:t>
+      </w:r>
+    </w:p>
+    <w:p>
+      <w:pPr>
+        <w:shd w:fill="F4ECF7" w:val="solid"/>
+        <w:spacing w:after="80" w:before="80"/>
+      </w:pPr>
+      <w:r>
+        <w:rPr>
+          <w:rFonts w:ascii="Calibri" w:cs="Calibri" w:eastAsia="Calibri" w:hAnsi="Calibri"/>
+          <w:color w:val="2980B9"/>
+          <w:sz w:val="20"/>
+          <w:szCs w:val="20"/>
+        </w:rPr>
+        <w:t xml:space="preserve">RBAC (Role-Based Access Control) = systém prístupu na základe rolí. Jednoducho povedané: každý používateľ dostane rolu (napr. Administrátor, Obchodný zástupca, Manažér), a táto rola určuje čo môže v systéme vidieť a robiť.</w:t>
+      </w:r>
+    </w:p>
+    <w:p>
+      <w:pPr>
+        <w:spacing w:after="0" w:before="0"/>
+      </w:pPr>
+      <w:r>
+        <w:rPr>
+          <w:sz w:val="14"/>
+          <w:szCs w:val="14"/>
+        </w:rPr>
+        <w:t xml:space="preserve"/>
+      </w:r>
+    </w:p>
+    <w:p>
+      <w:pPr>
+        <w:spacing w:after="80" w:before="220"/>
+      </w:pPr>
+      <w:r>
+        <w:rPr>
+          <w:rFonts w:ascii="Calibri" w:cs="Calibri" w:eastAsia="Calibri" w:hAnsi="Calibri"/>
+          <w:b/>
+          <w:bCs/>
+          <w:color w:val="2980B9"/>
+          <w:sz w:val="22"/>
+          <w:szCs w:val="22"/>
+        </w:rPr>
+        <w:t xml:space="preserve">Starý spôsob vs. RBAC</w:t>
+      </w:r>
+    </w:p>
+    <w:tbl>
+      <w:tblPr>
+        <w:tblW w:type="pct" w:w="100%"/>
+        <w:tblBorders>
+          <w:top w:val="single" w:color="auto" w:sz="4"/>
+          <w:left w:val="single" w:color="auto" w:sz="4"/>
+          <w:bottom w:val="single" w:color="auto" w:sz="4"/>
+          <w:right w:val="single" w:color="auto" w:sz="4"/>
+          <w:insideH w:val="single" w:color="auto" w:sz="4"/>
+          <w:insideV w:val="single" w:color="auto" w:sz="4"/>
+        </w:tblBorders>
+        <w:tblLayout w:type="fixed"/>
+      </w:tblPr>
+      <w:tblGrid>
+        <w:gridCol w:w="100"/>
+        <w:gridCol w:w="100"/>
+        <w:gridCol w:w="100"/>
+      </w:tblGrid>
+      <w:tr>
+        <w:trPr>
+          <w:tblHeader/>
+        </w:trPr>
+        <w:tc>
+          <w:tcPr>
+            <w:tcW w:type="dxa" w:w="2000"/>
+            <w:shd w:fill="2C3E50" w:val="solid"/>
+            <w:tcMar>
+              <w:top w:type="dxa" w:w="60"/>
+              <w:left w:type="dxa" w:w="100"/>
+              <w:bottom w:type="dxa" w:w="60"/>
+              <w:right w:type="dxa" w:w="100"/>
+            </w:tcMar>
+          </w:tcPr>
+          <w:p>
+            <w:pPr>
+              <w:spacing w:after="50" w:before="50"/>
+              <w:jc w:val="center"/>
+            </w:pPr>
+            <w:r>
+              <w:rPr>
+                <w:rFonts w:ascii="Calibri" w:cs="Calibri" w:eastAsia="Calibri" w:hAnsi="Calibri"/>
+                <w:b/>
+                <w:bCs/>
+                <w:color w:val="FFFFFF"/>
+                <w:sz w:val="18"/>
+                <w:szCs w:val="18"/>
+              </w:rPr>
+              <w:t xml:space="preserve"/>
+            </w:r>
+          </w:p>
+        </w:tc>
+        <w:tc>
+          <w:tcPr>
+            <w:tcW w:type="dxa" w:w="3200"/>
+            <w:shd w:fill="2C3E50" w:val="solid"/>
+            <w:tcMar>
+              <w:top w:type="dxa" w:w="60"/>
+              <w:left w:type="dxa" w:w="100"/>
+              <w:bottom w:type="dxa" w:w="60"/>
+              <w:right w:type="dxa" w:w="100"/>
+            </w:tcMar>
+          </w:tcPr>
+          <w:p>
+            <w:pPr>
+              <w:spacing w:after="50" w:before="50"/>
+              <w:jc w:val="center"/>
+            </w:pPr>
+            <w:r>
+              <w:rPr>
+                <w:rFonts w:ascii="Calibri" w:cs="Calibri" w:eastAsia="Calibri" w:hAnsi="Calibri"/>
+                <w:b/>
+                <w:bCs/>
+                <w:color w:val="FFFFFF"/>
+                <w:sz w:val="18"/>
+                <w:szCs w:val="18"/>
+              </w:rPr>
+              <w:t xml:space="preserve">Starý spôsob (role stĺpec)</w:t>
+            </w:r>
+          </w:p>
+        </w:tc>
+        <w:tc>
+          <w:tcPr>
+            <w:tcW w:type="dxa" w:w="3300"/>
+            <w:shd w:fill="2C3E50" w:val="solid"/>
+            <w:tcMar>
+              <w:top w:type="dxa" w:w="60"/>
+              <w:left w:type="dxa" w:w="100"/>
+              <w:bottom w:type="dxa" w:w="60"/>
+              <w:right w:type="dxa" w:w="100"/>
+            </w:tcMar>
+          </w:tcPr>
+          <w:p>
+            <w:pPr>
+              <w:spacing w:after="50" w:before="50"/>
+              <w:jc w:val="center"/>
+            </w:pPr>
+            <w:r>
+              <w:rPr>
+                <w:rFonts w:ascii="Calibri" w:cs="Calibri" w:eastAsia="Calibri" w:hAnsi="Calibri"/>
+                <w:b/>
+                <w:bCs/>
+                <w:color w:val="FFFFFF"/>
+                <w:sz w:val="18"/>
+                <w:szCs w:val="18"/>
+              </w:rPr>
+              <w:t xml:space="preserve">Nový spôsob (RBAC / user_roles)</w:t>
+            </w:r>
+          </w:p>
+        </w:tc>
+      </w:tr>
+      <w:tr>
+        <w:tc>
+          <w:tcPr>
+            <w:tcW w:type="dxa" w:w="2000"/>
+            <w:tcMar>
+              <w:top w:type="dxa" w:w="60"/>
+              <w:left w:type="dxa" w:w="100"/>
+              <w:bottom w:type="dxa" w:w="60"/>
+              <w:right w:type="dxa" w:w="100"/>
+            </w:tcMar>
+          </w:tcPr>
+          <w:p>
+            <w:pPr>
+              <w:spacing w:after="50" w:before="50"/>
+              <w:jc w:val="left"/>
+            </w:pPr>
+            <w:r>
+              <w:rPr>
+                <w:rFonts w:ascii="Calibri" w:cs="Calibri" w:eastAsia="Calibri" w:hAnsi="Calibri"/>
+                <w:b/>
+                <w:bCs/>
+                <w:sz w:val="18"/>
+                <w:szCs w:val="18"/>
+              </w:rPr>
+              <w:t xml:space="preserve">Ako funguje</w:t>
+            </w:r>
+          </w:p>
+        </w:tc>
+        <w:tc>
+          <w:tcPr>
+            <w:tcW w:type="dxa" w:w="3200"/>
+            <w:tcMar>
+              <w:top w:type="dxa" w:w="60"/>
+              <w:left w:type="dxa" w:w="100"/>
+              <w:bottom w:type="dxa" w:w="60"/>
+              <w:right w:type="dxa" w:w="100"/>
+            </w:tcMar>
+          </w:tcPr>
+          <w:p>
+            <w:pPr>
+              <w:spacing w:after="50" w:before="50"/>
+              <w:jc w:val="left"/>
+            </w:pPr>
+            <w:r>
+              <w:rPr>
+                <w:rFonts w:ascii="Calibri" w:cs="Calibri" w:eastAsia="Calibri" w:hAnsi="Calibri"/>
+                <w:sz w:val="18"/>
+                <w:szCs w:val="18"/>
+              </w:rPr>
+              <w:t xml:space="preserve">Každý používateľ má priamo napísanú rolu ako text (napr. 'admin')</w:t>
+            </w:r>
+          </w:p>
+        </w:tc>
+        <w:tc>
+          <w:tcPr>
+            <w:tcW w:type="dxa" w:w="3300"/>
+            <w:tcMar>
+              <w:top w:type="dxa" w:w="60"/>
+              <w:left w:type="dxa" w:w="100"/>
+              <w:bottom w:type="dxa" w:w="60"/>
+              <w:right w:type="dxa" w:w="100"/>
+            </w:tcMar>
+          </w:tcPr>
+          <w:p>
+            <w:pPr>
+              <w:spacing w:after="50" w:before="50"/>
+              <w:jc w:val="left"/>
+            </w:pPr>
+            <w:r>
+              <w:rPr>
+                <w:rFonts w:ascii="Calibri" w:cs="Calibri" w:eastAsia="Calibri" w:hAnsi="Calibri"/>
+                <w:sz w:val="18"/>
+                <w:szCs w:val="18"/>
+              </w:rPr>
+              <w:t xml:space="preserve">Každý používateľ má priradenú rolu z tabuľky rolí — rola má presne definované oprávnenia</w:t>
+            </w:r>
+          </w:p>
+        </w:tc>
+      </w:tr>
+      <w:tr>
+        <w:tc>
+          <w:tcPr>
+            <w:tcW w:type="dxa" w:w="2000"/>
+            <w:tcMar>
+              <w:top w:type="dxa" w:w="60"/>
+              <w:left w:type="dxa" w:w="100"/>
+              <w:bottom w:type="dxa" w:w="60"/>
+              <w:right w:type="dxa" w:w="100"/>
+            </w:tcMar>
+          </w:tcPr>
+          <w:p>
+            <w:pPr>
+              <w:spacing w:after="50" w:before="50"/>
+              <w:jc w:val="left"/>
+            </w:pPr>
+            <w:r>
+              <w:rPr>
+                <w:rFonts w:ascii="Calibri" w:cs="Calibri" w:eastAsia="Calibri" w:hAnsi="Calibri"/>
+                <w:b/>
+                <w:bCs/>
+                <w:sz w:val="18"/>
+                <w:szCs w:val="18"/>
+              </w:rPr>
+              <w:t xml:space="preserve">Kto môže rolu zmeniť</w:t>
+            </w:r>
+          </w:p>
+        </w:tc>
+        <w:tc>
+          <w:tcPr>
+            <w:tcW w:type="dxa" w:w="3200"/>
+            <w:tcMar>
+              <w:top w:type="dxa" w:w="60"/>
+              <w:left w:type="dxa" w:w="100"/>
+              <w:bottom w:type="dxa" w:w="60"/>
+              <w:right w:type="dxa" w:w="100"/>
+            </w:tcMar>
+          </w:tcPr>
+          <w:p>
+            <w:pPr>
+              <w:spacing w:after="50" w:before="50"/>
+              <w:jc w:val="left"/>
+            </w:pPr>
+            <w:r>
+              <w:rPr>
+                <w:rFonts w:ascii="Calibri" w:cs="Calibri" w:eastAsia="Calibri" w:hAnsi="Calibri"/>
+                <w:sz w:val="18"/>
+                <w:szCs w:val="18"/>
+              </w:rPr>
+              <w:t xml:space="preserve">Len programátor (zmena v DB alebo kóde)</w:t>
+            </w:r>
+          </w:p>
+        </w:tc>
+        <w:tc>
+          <w:tcPr>
+            <w:tcW w:type="dxa" w:w="3300"/>
+            <w:tcMar>
+              <w:top w:type="dxa" w:w="60"/>
+              <w:left w:type="dxa" w:w="100"/>
+              <w:bottom w:type="dxa" w:w="60"/>
+              <w:right w:type="dxa" w:w="100"/>
+            </w:tcMar>
+          </w:tcPr>
+          <w:p>
+            <w:pPr>
+              <w:spacing w:after="50" w:before="50"/>
+              <w:jc w:val="left"/>
+            </w:pPr>
+            <w:r>
+              <w:rPr>
+                <w:rFonts w:ascii="Calibri" w:cs="Calibri" w:eastAsia="Calibri" w:hAnsi="Calibri"/>
+                <w:color w:val="27AE60"/>
+                <w:sz w:val="18"/>
+                <w:szCs w:val="18"/>
+              </w:rPr>
+              <w:t xml:space="preserve">Administrátor v INDEXUS cez UI — bez programátora</w:t>
+            </w:r>
+          </w:p>
+        </w:tc>
+      </w:tr>
+      <w:tr>
+        <w:tc>
+          <w:tcPr>
+            <w:tcW w:type="dxa" w:w="2000"/>
+            <w:tcMar>
+              <w:top w:type="dxa" w:w="60"/>
+              <w:left w:type="dxa" w:w="100"/>
+              <w:bottom w:type="dxa" w:w="60"/>
+              <w:right w:type="dxa" w:w="100"/>
+            </w:tcMar>
+          </w:tcPr>
+          <w:p>
+            <w:pPr>
+              <w:spacing w:after="50" w:before="50"/>
+              <w:jc w:val="left"/>
+            </w:pPr>
+            <w:r>
+              <w:rPr>
+                <w:rFonts w:ascii="Calibri" w:cs="Calibri" w:eastAsia="Calibri" w:hAnsi="Calibri"/>
+                <w:b/>
+                <w:bCs/>
+                <w:sz w:val="18"/>
+                <w:szCs w:val="18"/>
+              </w:rPr>
+              <w:t xml:space="preserve">Flexibilita</w:t>
+            </w:r>
+          </w:p>
+        </w:tc>
+        <w:tc>
+          <w:tcPr>
+            <w:tcW w:type="dxa" w:w="3200"/>
+            <w:tcMar>
+              <w:top w:type="dxa" w:w="60"/>
+              <w:left w:type="dxa" w:w="100"/>
+              <w:bottom w:type="dxa" w:w="60"/>
+              <w:right w:type="dxa" w:w="100"/>
+            </w:tcMar>
+          </w:tcPr>
+          <w:p>
+            <w:pPr>
+              <w:spacing w:after="50" w:before="50"/>
+              <w:jc w:val="left"/>
+            </w:pPr>
+            <w:r>
+              <w:rPr>
+                <w:rFonts w:ascii="Calibri" w:cs="Calibri" w:eastAsia="Calibri" w:hAnsi="Calibri"/>
+                <w:color w:val="E67E22"/>
+                <w:sz w:val="18"/>
+                <w:szCs w:val="18"/>
+              </w:rPr>
+              <w:t xml:space="preserve">Obmedzená — pridať novú rolu = zmena kódu</w:t>
+            </w:r>
+          </w:p>
+        </w:tc>
+        <w:tc>
+          <w:tcPr>
+            <w:tcW w:type="dxa" w:w="3300"/>
+            <w:tcMar>
+              <w:top w:type="dxa" w:w="60"/>
+              <w:left w:type="dxa" w:w="100"/>
+              <w:bottom w:type="dxa" w:w="60"/>
+              <w:right w:type="dxa" w:w="100"/>
+            </w:tcMar>
+          </w:tcPr>
+          <w:p>
+            <w:pPr>
+              <w:spacing w:after="50" w:before="50"/>
+              <w:jc w:val="left"/>
+            </w:pPr>
+            <w:r>
+              <w:rPr>
+                <w:rFonts w:ascii="Calibri" w:cs="Calibri" w:eastAsia="Calibri" w:hAnsi="Calibri"/>
+                <w:color w:val="27AE60"/>
+                <w:sz w:val="18"/>
+                <w:szCs w:val="18"/>
+              </w:rPr>
+              <w:t xml:space="preserve">Vysoká — novú rolu vytvorí admin za 5 minút</w:t>
+            </w:r>
+          </w:p>
+        </w:tc>
+      </w:tr>
+      <w:tr>
+        <w:tc>
+          <w:tcPr>
+            <w:tcW w:type="dxa" w:w="2000"/>
+            <w:tcMar>
+              <w:top w:type="dxa" w:w="60"/>
+              <w:left w:type="dxa" w:w="100"/>
+              <w:bottom w:type="dxa" w:w="60"/>
+              <w:right w:type="dxa" w:w="100"/>
+            </w:tcMar>
+          </w:tcPr>
+          <w:p>
+            <w:pPr>
+              <w:spacing w:after="50" w:before="50"/>
+              <w:jc w:val="left"/>
+            </w:pPr>
+            <w:r>
+              <w:rPr>
+                <w:rFonts w:ascii="Calibri" w:cs="Calibri" w:eastAsia="Calibri" w:hAnsi="Calibri"/>
+                <w:b/>
+                <w:bCs/>
+                <w:sz w:val="18"/>
+                <w:szCs w:val="18"/>
+              </w:rPr>
+              <w:t xml:space="preserve">Oprávnenia per modul</w:t>
+            </w:r>
+          </w:p>
+        </w:tc>
+        <w:tc>
+          <w:tcPr>
+            <w:tcW w:type="dxa" w:w="3200"/>
+            <w:tcMar>
+              <w:top w:type="dxa" w:w="60"/>
+              <w:left w:type="dxa" w:w="100"/>
+              <w:bottom w:type="dxa" w:w="60"/>
+              <w:right w:type="dxa" w:w="100"/>
+            </w:tcMar>
+          </w:tcPr>
+          <w:p>
+            <w:pPr>
+              <w:spacing w:after="50" w:before="50"/>
+              <w:jc w:val="left"/>
+            </w:pPr>
+            <w:r>
+              <w:rPr>
+                <w:rFonts w:ascii="Calibri" w:cs="Calibri" w:eastAsia="Calibri" w:hAnsi="Calibri"/>
+                <w:color w:val="E67E22"/>
+                <w:sz w:val="18"/>
+                <w:szCs w:val="18"/>
+              </w:rPr>
+              <w:t xml:space="preserve">Pevne naprogramované</w:t>
+            </w:r>
+          </w:p>
+        </w:tc>
+        <w:tc>
+          <w:tcPr>
+            <w:tcW w:type="dxa" w:w="3300"/>
+            <w:tcMar>
+              <w:top w:type="dxa" w:w="60"/>
+              <w:left w:type="dxa" w:w="100"/>
+              <w:bottom w:type="dxa" w:w="60"/>
+              <w:right w:type="dxa" w:w="100"/>
+            </w:tcMar>
+          </w:tcPr>
+          <w:p>
+            <w:pPr>
+              <w:spacing w:after="50" w:before="50"/>
+              <w:jc w:val="left"/>
+            </w:pPr>
+            <w:r>
+              <w:rPr>
+                <w:rFonts w:ascii="Calibri" w:cs="Calibri" w:eastAsia="Calibri" w:hAnsi="Calibri"/>
+                <w:color w:val="27AE60"/>
+                <w:sz w:val="18"/>
+                <w:szCs w:val="18"/>
+              </w:rPr>
+              <w:t xml:space="preserve">Konfigurovateľné per modul, per pole (citlivé dáta)</w:t>
+            </w:r>
+          </w:p>
+        </w:tc>
+      </w:tr>
+      <w:tr>
+        <w:tc>
+          <w:tcPr>
+            <w:tcW w:type="dxa" w:w="2000"/>
+            <w:tcMar>
+              <w:top w:type="dxa" w:w="60"/>
+              <w:left w:type="dxa" w:w="100"/>
+              <w:bottom w:type="dxa" w:w="60"/>
+              <w:right w:type="dxa" w:w="100"/>
+            </w:tcMar>
+          </w:tcPr>
+          <w:p>
+            <w:pPr>
+              <w:spacing w:after="50" w:before="50"/>
+              <w:jc w:val="left"/>
+            </w:pPr>
+            <w:r>
+              <w:rPr>
+                <w:rFonts w:ascii="Calibri" w:cs="Calibri" w:eastAsia="Calibri" w:hAnsi="Calibri"/>
+                <w:b/>
+                <w:bCs/>
+                <w:sz w:val="18"/>
+                <w:szCs w:val="18"/>
+              </w:rPr>
+              <w:t xml:space="preserve">Stav v INDEXUS</w:t>
+            </w:r>
+          </w:p>
+        </w:tc>
+        <w:tc>
+          <w:tcPr>
+            <w:tcW w:type="dxa" w:w="3200"/>
+            <w:tcMar>
+              <w:top w:type="dxa" w:w="60"/>
+              <w:left w:type="dxa" w:w="100"/>
+              <w:bottom w:type="dxa" w:w="60"/>
+              <w:right w:type="dxa" w:w="100"/>
+            </w:tcMar>
+          </w:tcPr>
+          <w:p>
+            <w:pPr>
+              <w:spacing w:after="50" w:before="50"/>
+              <w:jc w:val="left"/>
+            </w:pPr>
+            <w:r>
+              <w:rPr>
+                <w:rFonts w:ascii="Calibri" w:cs="Calibri" w:eastAsia="Calibri" w:hAnsi="Calibri"/>
+                <w:color w:val="E67E22"/>
+                <w:sz w:val="18"/>
+                <w:szCs w:val="18"/>
+              </w:rPr>
+              <w:t xml:space="preserve">Aktuálne používaný (všetkých 12 používateľov)</w:t>
+            </w:r>
+          </w:p>
+        </w:tc>
+        <w:tc>
+          <w:tcPr>
+            <w:tcW w:type="dxa" w:w="3300"/>
+            <w:tcMar>
+              <w:top w:type="dxa" w:w="60"/>
+              <w:left w:type="dxa" w:w="100"/>
+              <w:bottom w:type="dxa" w:w="60"/>
+              <w:right w:type="dxa" w:w="100"/>
+            </w:tcMar>
+          </w:tcPr>
+          <w:p>
+            <w:pPr>
+              <w:spacing w:after="50" w:before="50"/>
+              <w:jc w:val="left"/>
+            </w:pPr>
+            <w:r>
+              <w:rPr>
+                <w:rFonts w:ascii="Calibri" w:cs="Calibri" w:eastAsia="Calibri" w:hAnsi="Calibri"/>
+                <w:color w:val="2980B9"/>
+                <w:sz w:val="18"/>
+                <w:szCs w:val="18"/>
+              </w:rPr>
+              <w:t xml:space="preserve">Pripravený — tabuľky naplnené, čaká na migráciu</w:t>
+            </w:r>
+          </w:p>
+        </w:tc>
+      </w:tr>
+    </w:tbl>
+    <w:p>
+      <w:pPr>
+        <w:spacing w:after="0" w:before="0"/>
+      </w:pPr>
+      <w:r>
+        <w:rPr>
+          <w:sz w:val="14"/>
+          <w:szCs w:val="14"/>
+        </w:rPr>
+        <w:t xml:space="preserve"/>
+      </w:r>
+    </w:p>
+    <w:p>
+      <w:pPr>
+        <w:spacing w:after="40" w:before="40"/>
+      </w:pPr>
+      <w:r>
+        <w:rPr>
+          <w:rFonts w:ascii="Calibri" w:cs="Calibri" w:eastAsia="Calibri" w:hAnsi="Calibri"/>
+          <w:i/>
+          <w:iCs/>
+          <w:color w:val="7F8C8D"/>
+          <w:sz w:val="20"/>
+          <w:szCs w:val="20"/>
+        </w:rPr>
+        <w:t xml:space="preserve">Príklad: Po migrácii bude môcť admin nastaviť, že Obchodný zástupca vidí zákazníkov len svojej krajiny, nemôže mazať zmluvy a nevidí bankové údaje. Bez RBAC toto nie je možné bez zmeny kódu.</w:t>
+      </w:r>
+    </w:p>
+    <w:p>
+      <w:pPr>
+        <w:spacing w:after="0" w:before="0"/>
+      </w:pPr>
+      <w:r>
+        <w:rPr>
+          <w:sz w:val="14"/>
+          <w:szCs w:val="14"/>
+        </w:rPr>
+        <w:t xml:space="preserve"/>
+      </w:r>
+    </w:p>
+    <w:p>
+      <w:pPr>
+        <w:spacing w:after="80" w:before="220"/>
+      </w:pPr>
+      <w:r>
+        <w:rPr>
+          <w:rFonts w:ascii="Calibri" w:cs="Calibri" w:eastAsia="Calibri" w:hAnsi="Calibri"/>
+          <w:b/>
+          <w:bCs/>
+          <w:color w:val="2980B9"/>
+          <w:sz w:val="22"/>
+          <w:szCs w:val="22"/>
+        </w:rPr>
+        <w:t xml:space="preserve">Aktuálny stav</w:t>
+      </w:r>
+    </w:p>
+    <w:p>
+      <w:pPr>
         <w:pStyle w:val="ListParagraph"/>
         <w:numPr>
           <w:ilvl w:val="0"/>
@@ -10398,7 +11435,28 @@
           <w:sz w:val="20"/>
           <w:szCs w:val="20"/>
         </w:rPr>
-        <w:t xml:space="preserve">Všetci 12 nemajú záznam v user_roles — používajú starý role stĺpec ⚠️</w:t>
+        <w:t xml:space="preserve">Všetci 12 stále používajú starý role stĺpec ⚠️</w:t>
+      </w:r>
+    </w:p>
+    <w:p>
+      <w:pPr>
+        <w:pStyle w:val="ListParagraph"/>
+        <w:numPr>
+          <w:ilvl w:val="0"/>
+          <w:numId w:val="1"/>
+        </w:numPr>
+        <w:spacing w:after="20" w:before="20"/>
+      </w:pPr>
+      <w:r>
+        <w:rPr>
+          <w:rFonts w:ascii="Calibri" w:cs="Calibri" w:eastAsia="Calibri" w:hAnsi="Calibri"/>
+          <w:b w:val="false"/>
+          <w:bCs w:val="false"/>
+          <w:color w:val="27AE60"/>
+          <w:sz w:val="20"/>
+          <w:szCs w:val="20"/>
+        </w:rPr>
+        <w:t xml:space="preserve">Tabuľky user_roles a role_module_permissions sú naplnené — RBAC je technicky pripravený ✅</w:t>
       </w:r>
     </w:p>
     <w:p>
@@ -10419,7 +11477,7 @@
           <w:sz w:val="20"/>
           <w:szCs w:val="20"/>
         </w:rPr>
-        <w:t xml:space="preserve">role_module_permissions tabuľka je naplnená (RBAC je pripravený)</w:t>
+        <w:t xml:space="preserve">Migrácia = jednorazová akcia: priradiť každému používateľovi správnu rolu v novom systéme (cca 1 hod.)</w:t>
       </w:r>
     </w:p>
     <w:p>

</xml_diff>